<commit_message>
docs(external-pay): document 5s callback timeout in webhook guide
After switching the chatbot callback from fire-and-forget to a 5-second
awaited fetch, update the Delivery Semantics section so chatbot devs
know: callbacks are bounded at 5s, the user's success/error page waits
for the callback before rendering, and slow webhooks delay the user.
</commit_message>
<xml_diff>
--- a/docs/ali-access-payment-webhooks.docx
+++ b/docs/ali-access-payment-webhooks.docx
@@ -4804,7 +4804,7 @@
         <w:rPr>
           <w:color w:val="000000"/>
         </w:rPr>
-        <w:t xml:space="preserve">At-most-once delivery. Fire-and-forget, no retries on 5xx, no exponential backoff.</w:t>
+        <w:t xml:space="preserve">At-most-once delivery. Single attempt per event, no retries, no exponential backoff.</w:t>
       </w:r>
     </w:p>
     <w:p>
@@ -4820,7 +4820,21 @@
         <w:rPr>
           <w:color w:val="000000"/>
         </w:rPr>
-        <w:t xml:space="preserve">Your endpoint’s response code is ignored. Returning 200 vs 500 makes no difference to the platform.</w:t>
+        <w:t xml:space="preserve">Bounded wait — the platform awaits your response with a </w:t>
+      </w:r>
+      <w:r>
+        <w:rPr>
+          <w:b/>
+          <w:bCs/>
+          <w:color w:val="0E2C20"/>
+        </w:rPr>
+        <w:t xml:space="preserve">5-second timeout</w:t>
+      </w:r>
+      <w:r>
+        <w:rPr>
+          <w:color w:val="000000"/>
+        </w:rPr>
+        <w:t xml:space="preserve">. After 5 seconds the request is aborted server-side and the event is dropped.</w:t>
       </w:r>
     </w:p>
     <w:p>
@@ -4836,7 +4850,39 @@
         <w:rPr>
           <w:color w:val="000000"/>
         </w:rPr>
-        <w:t xml:space="preserve">Network failures or DNS lookup failures are silently dropped (logged server-side only).</w:t>
+        <w:t xml:space="preserve">Your endpoint’s HTTP response code is ignored. Returning </w:t>
+      </w:r>
+      <w:r>
+        <w:rPr>
+          <w:rFonts w:ascii="Consolas" w:cs="Consolas" w:eastAsia="Consolas" w:hAnsi="Consolas"/>
+          <w:color w:val="0E2C20"/>
+          <w:sz w:val="20"/>
+          <w:szCs w:val="20"/>
+          <w:shd w:fill="F5F1E9" w:val="clear"/>
+        </w:rPr>
+        <w:t xml:space="preserve">200</w:t>
+      </w:r>
+      <w:r>
+        <w:rPr>
+          <w:color w:val="000000"/>
+        </w:rPr>
+        <w:t xml:space="preserve"> vs </w:t>
+      </w:r>
+      <w:r>
+        <w:rPr>
+          <w:rFonts w:ascii="Consolas" w:cs="Consolas" w:eastAsia="Consolas" w:hAnsi="Consolas"/>
+          <w:color w:val="0E2C20"/>
+          <w:sz w:val="20"/>
+          <w:szCs w:val="20"/>
+          <w:shd w:fill="F5F1E9" w:val="clear"/>
+        </w:rPr>
+        <w:t xml:space="preserve">500</w:t>
+      </w:r>
+      <w:r>
+        <w:rPr>
+          <w:color w:val="000000"/>
+        </w:rPr>
+        <w:t xml:space="preserve"> makes no difference to the platform — non-2xx is not logged, not retried.</w:t>
       </w:r>
     </w:p>
     <w:p>
@@ -4852,18 +4898,7 @@
         <w:rPr>
           <w:color w:val="000000"/>
         </w:rPr>
-        <w:t xml:space="preserve">No callback fires if the user closes the tab without paying or after a Stripe error — treat absence after expiresAt as "abandoned".</w:t>
-      </w:r>
-    </w:p>
-    <w:p>
-      <w:pPr>
-        <w:pStyle w:val="Heading2"/>
-      </w:pPr>
-      <w:r>
-        <w:rPr>
-          <w:color w:val="0E2C20"/>
-        </w:rPr>
-        <w:t xml:space="preserve">Idempotency</w:t>
+        <w:t xml:space="preserve">Network failures, DNS lookup failures, and timeouts are silently dropped (logged server-side only).</w:t>
       </w:r>
     </w:p>
     <w:p>
@@ -4879,39 +4914,21 @@
         <w:rPr>
           <w:color w:val="000000"/>
         </w:rPr>
-        <w:t xml:space="preserve">Use </w:t>
-      </w:r>
-      <w:r>
-        <w:rPr>
-          <w:rFonts w:ascii="Consolas" w:cs="Consolas" w:eastAsia="Consolas" w:hAnsi="Consolas"/>
-          <w:color w:val="0E2C20"/>
-          <w:sz w:val="20"/>
-          <w:szCs w:val="20"/>
-          <w:shd w:fill="F5F1E9" w:val="clear"/>
-        </w:rPr>
-        <w:t xml:space="preserve">paymentIntentId</w:t>
-      </w:r>
-      <w:r>
-        <w:rPr>
-          <w:color w:val="000000"/>
-        </w:rPr>
-        <w:t xml:space="preserve"> (success) or </w:t>
-      </w:r>
-      <w:r>
-        <w:rPr>
-          <w:rFonts w:ascii="Consolas" w:cs="Consolas" w:eastAsia="Consolas" w:hAnsi="Consolas"/>
-          <w:color w:val="0E2C20"/>
-          <w:sz w:val="20"/>
-          <w:szCs w:val="20"/>
-          <w:shd w:fill="F5F1E9" w:val="clear"/>
-        </w:rPr>
-        <w:t xml:space="preserve">paymentId</w:t>
-      </w:r>
-      <w:r>
-        <w:rPr>
-          <w:color w:val="000000"/>
-        </w:rPr>
-        <w:t xml:space="preserve"> (success) as the deduplication key. Both are unique per successful charge.</w:t>
+        <w:t xml:space="preserve">The user’s success / error page is rendered </w:t>
+      </w:r>
+      <w:r>
+        <w:rPr>
+          <w:i/>
+          <w:iCs/>
+          <w:color w:val="000000"/>
+        </w:rPr>
+        <w:t xml:space="preserve">after</w:t>
+      </w:r>
+      <w:r>
+        <w:rPr>
+          <w:color w:val="000000"/>
+        </w:rPr>
+        <w:t xml:space="preserve"> the platform attempts to deliver your callback. A slow webhook delays the user’s confirmation page by up to 5 seconds. Aim to respond in under 1 second to keep the demo snappy.</w:t>
       </w:r>
     </w:p>
     <w:p>
@@ -4927,7 +4944,7 @@
         <w:rPr>
           <w:color w:val="000000"/>
         </w:rPr>
-        <w:t xml:space="preserve">Failure events are not deduplicated by the platform. If a user attempts and fails twice, you will receive two POSTs.</w:t>
+        <w:t xml:space="preserve">No callback fires if the user closes the tab without paying or after a Stripe error — treat absence after expiresAt as "abandoned".</w:t>
       </w:r>
     </w:p>
     <w:p>
@@ -4938,7 +4955,7 @@
         <w:rPr>
           <w:color w:val="0E2C20"/>
         </w:rPr>
-        <w:t xml:space="preserve">Authentication &amp; trust</w:t>
+        <w:t xml:space="preserve">Idempotency</w:t>
       </w:r>
     </w:p>
     <w:p>
@@ -4954,7 +4971,39 @@
         <w:rPr>
           <w:color w:val="000000"/>
         </w:rPr>
-        <w:t xml:space="preserve">No HMAC signature in this version. The chatbot identifies a run via sessionId / invoiceNumber from the original mint.</w:t>
+        <w:t xml:space="preserve">Use </w:t>
+      </w:r>
+      <w:r>
+        <w:rPr>
+          <w:rFonts w:ascii="Consolas" w:cs="Consolas" w:eastAsia="Consolas" w:hAnsi="Consolas"/>
+          <w:color w:val="0E2C20"/>
+          <w:sz w:val="20"/>
+          <w:szCs w:val="20"/>
+          <w:shd w:fill="F5F1E9" w:val="clear"/>
+        </w:rPr>
+        <w:t xml:space="preserve">paymentIntentId</w:t>
+      </w:r>
+      <w:r>
+        <w:rPr>
+          <w:color w:val="000000"/>
+        </w:rPr>
+        <w:t xml:space="preserve"> (success) or </w:t>
+      </w:r>
+      <w:r>
+        <w:rPr>
+          <w:rFonts w:ascii="Consolas" w:cs="Consolas" w:eastAsia="Consolas" w:hAnsi="Consolas"/>
+          <w:color w:val="0E2C20"/>
+          <w:sz w:val="20"/>
+          <w:szCs w:val="20"/>
+          <w:shd w:fill="F5F1E9" w:val="clear"/>
+        </w:rPr>
+        <w:t xml:space="preserve">paymentId</w:t>
+      </w:r>
+      <w:r>
+        <w:rPr>
+          <w:color w:val="000000"/>
+        </w:rPr>
+        <w:t xml:space="preserve"> (success) as the deduplication key. Both are unique per successful charge.</w:t>
       </w:r>
     </w:p>
     <w:p>
@@ -4970,7 +5019,18 @@
         <w:rPr>
           <w:color w:val="000000"/>
         </w:rPr>
-        <w:t xml:space="preserve">Treat callback bodies as untrusted source data. Do not echo errorMessage back to users without sanitizing.</w:t>
+        <w:t xml:space="preserve">Failure events are not deduplicated by the platform. If a user attempts and fails twice, you will receive two POSTs.</w:t>
+      </w:r>
+    </w:p>
+    <w:p>
+      <w:pPr>
+        <w:pStyle w:val="Heading2"/>
+      </w:pPr>
+      <w:r>
+        <w:rPr>
+          <w:color w:val="0E2C20"/>
+        </w:rPr>
+        <w:t xml:space="preserve">Authentication &amp; trust</w:t>
       </w:r>
     </w:p>
     <w:p>
@@ -4986,18 +5046,7 @@
         <w:rPr>
           <w:color w:val="000000"/>
         </w:rPr>
-        <w:t xml:space="preserve">Validate that fields you depend on are present before using them — amount, currency, status are guaranteed; sessionId is not.</w:t>
-      </w:r>
-    </w:p>
-    <w:p>
-      <w:pPr>
-        <w:pStyle w:val="Heading2"/>
-      </w:pPr>
-      <w:r>
-        <w:rPr>
-          <w:color w:val="0E2C20"/>
-        </w:rPr>
-        <w:t xml:space="preserve">Time / ordering</w:t>
+        <w:t xml:space="preserve">No HMAC signature in this version. The chatbot identifies a run via sessionId / invoiceNumber from the original mint.</w:t>
       </w:r>
     </w:p>
     <w:p>
@@ -5013,7 +5062,7 @@
         <w:rPr>
           <w:color w:val="000000"/>
         </w:rPr>
-        <w:t xml:space="preserve">timestamp is set at dispatch time, not at the moment of payment. They are usually within a second of each other but should not be treated as the canonical settlement timestamp — Stripe’s PaymentIntent timeline is.</w:t>
+        <w:t xml:space="preserve">Treat callback bodies as untrusted source data. Do not echo errorMessage back to users without sanitizing.</w:t>
       </w:r>
     </w:p>
     <w:p>
@@ -5029,29 +5078,18 @@
         <w:rPr>
           <w:color w:val="000000"/>
         </w:rPr>
-        <w:t xml:space="preserve">Events can arrive out of order if your endpoint is slow. If you need strict ordering, use timestamp.</w:t>
-      </w:r>
-    </w:p>
-    <w:p>
-      <w:pPr>
-        <w:pStyle w:val="Heading1"/>
+        <w:t xml:space="preserve">Validate that fields you depend on are present before using them — amount, currency, status are guaranteed; sessionId is not.</w:t>
+      </w:r>
+    </w:p>
+    <w:p>
+      <w:pPr>
+        <w:pStyle w:val="Heading2"/>
       </w:pPr>
       <w:r>
         <w:rPr>
           <w:color w:val="0E2C20"/>
         </w:rPr>
-        <w:t xml:space="preserve">6. End-to-end summary</w:t>
-      </w:r>
-    </w:p>
-    <w:p>
-      <w:pPr>
-        <w:spacing w:after="120"/>
-      </w:pPr>
-      <w:r>
-        <w:rPr>
-          <w:color w:val="000000"/>
-        </w:rPr>
-        <w:t xml:space="preserve">A typical chatbot integration looks like:</w:t>
+        <w:t xml:space="preserve">Time / ordering</w:t>
       </w:r>
     </w:p>
     <w:p>
@@ -5067,7 +5105,7 @@
         <w:rPr>
           <w:color w:val="000000"/>
         </w:rPr>
-        <w:t xml:space="preserve">User asks the chatbot to pay for invoice X.</w:t>
+        <w:t xml:space="preserve">timestamp is set at dispatch time, not at the moment of payment. They are usually within a second of each other but should not be treated as the canonical settlement timestamp — Stripe’s PaymentIntent timeline is.</w:t>
       </w:r>
     </w:p>
     <w:p>
@@ -5083,23 +5121,29 @@
         <w:rPr>
           <w:color w:val="000000"/>
         </w:rPr>
-        <w:t xml:space="preserve">Chatbot calls </w:t>
-      </w:r>
-      <w:r>
-        <w:rPr>
-          <w:rFonts w:ascii="Consolas" w:cs="Consolas" w:eastAsia="Consolas" w:hAnsi="Consolas"/>
+        <w:t xml:space="preserve">Events can arrive out of order if your endpoint is slow. If you need strict ordering, use timestamp.</w:t>
+      </w:r>
+    </w:p>
+    <w:p>
+      <w:pPr>
+        <w:pStyle w:val="Heading1"/>
+      </w:pPr>
+      <w:r>
+        <w:rPr>
           <w:color w:val="0E2C20"/>
-          <w:sz w:val="20"/>
-          <w:szCs w:val="20"/>
-          <w:shd w:fill="F5F1E9" w:val="clear"/>
-        </w:rPr>
-        <w:t xml:space="preserve">POST /api/external/payment-link</w:t>
-      </w:r>
-      <w:r>
-        <w:rPr>
-          <w:color w:val="000000"/>
-        </w:rPr>
-        <w:t xml:space="preserve"> with the invoice details and its own callback URL.</w:t>
+        </w:rPr>
+        <w:t xml:space="preserve">6. End-to-end summary</w:t>
+      </w:r>
+    </w:p>
+    <w:p>
+      <w:pPr>
+        <w:spacing w:after="120"/>
+      </w:pPr>
+      <w:r>
+        <w:rPr>
+          <w:color w:val="000000"/>
+        </w:rPr>
+        <w:t xml:space="preserve">A typical chatbot integration looks like:</w:t>
       </w:r>
     </w:p>
     <w:p>
@@ -5115,7 +5159,7 @@
         <w:rPr>
           <w:color w:val="000000"/>
         </w:rPr>
-        <w:t xml:space="preserve">Chatbot sends the returned url to the user via its messaging interface.</w:t>
+        <w:t xml:space="preserve">User asks the chatbot to pay for invoice X.</w:t>
       </w:r>
     </w:p>
     <w:p>
@@ -5131,7 +5175,23 @@
         <w:rPr>
           <w:color w:val="000000"/>
         </w:rPr>
-        <w:t xml:space="preserve">User opens the link, completes Stripe payment.</w:t>
+        <w:t xml:space="preserve">Chatbot calls </w:t>
+      </w:r>
+      <w:r>
+        <w:rPr>
+          <w:rFonts w:ascii="Consolas" w:cs="Consolas" w:eastAsia="Consolas" w:hAnsi="Consolas"/>
+          <w:color w:val="0E2C20"/>
+          <w:sz w:val="20"/>
+          <w:szCs w:val="20"/>
+          <w:shd w:fill="F5F1E9" w:val="clear"/>
+        </w:rPr>
+        <w:t xml:space="preserve">POST /api/external/payment-link</w:t>
+      </w:r>
+      <w:r>
+        <w:rPr>
+          <w:color w:val="000000"/>
+        </w:rPr>
+        <w:t xml:space="preserve"> with the invoice details and its own callback URL.</w:t>
       </w:r>
     </w:p>
     <w:p>
@@ -5147,6 +5207,38 @@
         <w:rPr>
           <w:color w:val="000000"/>
         </w:rPr>
+        <w:t xml:space="preserve">Chatbot sends the returned url to the user via its messaging interface.</w:t>
+      </w:r>
+    </w:p>
+    <w:p>
+      <w:pPr>
+        <w:pStyle w:val="ListParagraph"/>
+        <w:numPr>
+          <w:ilvl w:val="0"/>
+          <w:numId w:val="2"/>
+        </w:numPr>
+        <w:spacing w:after="60"/>
+      </w:pPr>
+      <w:r>
+        <w:rPr>
+          <w:color w:val="000000"/>
+        </w:rPr>
+        <w:t xml:space="preserve">User opens the link, completes Stripe payment.</w:t>
+      </w:r>
+    </w:p>
+    <w:p>
+      <w:pPr>
+        <w:pStyle w:val="ListParagraph"/>
+        <w:numPr>
+          <w:ilvl w:val="0"/>
+          <w:numId w:val="2"/>
+        </w:numPr>
+        <w:spacing w:after="60"/>
+      </w:pPr>
+      <w:r>
+        <w:rPr>
+          <w:color w:val="000000"/>
+        </w:rPr>
         <w:t xml:space="preserve">Chatbot receives a </w:t>
       </w:r>
       <w:r>
@@ -5186,7 +5278,7 @@
         </w:rPr>
         <w:t xml:space="preserve">For testing, use </w:t>
       </w:r>
-      <w:hyperlink w:history="1" r:id="rIdfkhpsndfob1jeddn4n5-_">
+      <w:hyperlink w:history="1" r:id="rIdvzaup99wtws_uuprkjabo">
         <w:r>
           <w:rPr>
             <w:color w:val="0E2C20"/>

</xml_diff>